<commit_message>
Revise presentation script to formal bid version (md + docx)
Co-Authored-By: Claude Fable 5 <noreply@anthropic.com>
Claude-Session: https://claude.ai/code/session_01AxuY1PbheECHyFwPY2eA1Y
</commit_message>
<xml_diff>
--- a/归档包/02_展陈策划/博彦科技展厅_10分钟汇报稿_导览式.docx
+++ b/归档包/02_展陈策划/博彦科技展厅_10分钟汇报稿_导览式.docx
@@ -11,7 +11,6 @@
         <w:rPr>
           <w:rFonts w:ascii="Calibri" w:hAnsi="Calibri" w:eastAsia="微软雅黑"/>
           <w:b/>
-          <w:i w:val="0"/>
           <w:color w:val="1B4F9C"/>
           <w:sz w:val="52"/>
         </w:rPr>
@@ -27,11 +26,10 @@
         <w:rPr>
           <w:rFonts w:ascii="Calibri" w:hAnsi="Calibri" w:eastAsia="微软雅黑"/>
           <w:b w:val="0"/>
-          <w:i w:val="0"/>
           <w:color w:val="0B1F3F"/>
           <w:sz w:val="30"/>
         </w:rPr>
-        <w:t>博彦科技深圳展厅 · 投标汇报</w:t>
+        <w:t>博彦科技深圳展厅设计施工项目 · 投标汇报</w:t>
       </w:r>
     </w:p>
     <w:p>
@@ -43,11 +41,10 @@
         <w:rPr>
           <w:rFonts w:ascii="Calibri" w:hAnsi="Calibri" w:eastAsia="微软雅黑"/>
           <w:b/>
-          <w:i w:val="0"/>
           <w:color w:val="008AAB"/>
           <w:sz w:val="26"/>
         </w:rPr>
-        <w:t>10 分钟导览式汇报稿</w:t>
+        <w:t>10 分钟汇报稿（导览式 · 正式版）</w:t>
       </w:r>
     </w:p>
     <w:p>
@@ -59,613 +56,15 @@
         <w:rPr>
           <w:rFonts w:ascii="Calibri" w:hAnsi="Calibri" w:eastAsia="微软雅黑"/>
           <w:b w:val="0"/>
-          <w:i w:val="0"/>
           <w:color w:val="667080"/>
           <w:sz w:val="18"/>
         </w:rPr>
-        <w:t>配合《BeyondTheHall_动态投标汇报》正片播放使用 · 括号内为翻页与动作提示 · 语速约 280 字/分钟</w:t>
+        <w:t>配合《BeyondTheHall_动态投标汇报》正片播放使用 · 括号内为翻页与动作提示 · 语速约 270 字/分钟</w:t>
       </w:r>
     </w:p>
     <w:p>
       <w:r>
         <w:br w:type="page"/>
-      </w:r>
-    </w:p>
-    <w:p>
-      <w:pPr>
-        <w:spacing w:after="160" w:before="280"/>
-      </w:pPr>
-      <w:r>
-        <w:rPr>
-          <w:rFonts w:ascii="Calibri" w:hAnsi="Calibri" w:eastAsia="微软雅黑"/>
-          <w:b/>
-          <w:i w:val="0"/>
-          <w:color w:val="1B4F9C"/>
-          <w:sz w:val="26"/>
-        </w:rPr>
-        <w:t>0:00–0:40　开场（P1 封面 → P2 目录）</w:t>
-      </w:r>
-    </w:p>
-    <w:p>
-      <w:pPr>
-        <w:spacing w:after="140" w:before="0"/>
-      </w:pPr>
-      <w:r>
-        <w:rPr>
-          <w:rFonts w:ascii="Calibri" w:hAnsi="Calibri" w:eastAsia="微软雅黑"/>
-          <w:b w:val="0"/>
-          <w:i w:val="0"/>
-          <w:sz w:val="22"/>
-        </w:rPr>
-        <w:t>各位领导，下午好。</w:t>
-      </w:r>
-    </w:p>
-    <w:p>
-      <w:pPr>
-        <w:spacing w:after="140" w:before="0"/>
-      </w:pPr>
-      <w:r>
-        <w:rPr>
-          <w:rFonts w:ascii="Calibri" w:hAnsi="Calibri" w:eastAsia="微软雅黑"/>
-          <w:b w:val="0"/>
-          <w:i w:val="0"/>
-          <w:sz w:val="22"/>
-        </w:rPr>
-        <w:t>今天这份汇报，我不想按常规念一遍平面图和效果图。接下来的十分钟，请各位把自己当成博彦科技最重要的一位客人——我带着您，从电梯口出发，把这 480 平方米的展厅，完整地走一遍。</w:t>
-      </w:r>
-    </w:p>
-    <w:p>
-      <w:pPr>
-        <w:spacing w:after="140" w:before="0"/>
-      </w:pPr>
-      <w:r>
-        <w:rPr>
-          <w:rFonts w:ascii="Calibri" w:hAnsi="Calibri" w:eastAsia="微软雅黑"/>
-          <w:b w:val="0"/>
-          <w:i w:val="0"/>
-          <w:sz w:val="22"/>
-        </w:rPr>
-        <w:t>（翻至目录）我们的路线很简单：先在前厅认识博彦，再进展厅读懂博彦，最后在会议室，和博彦坐下来谈合作。这也正是我们为每一位来访客户设计的完整旅程。</w:t>
-      </w:r>
-    </w:p>
-    <w:p>
-      <w:pPr>
-        <w:spacing w:after="160" w:before="280"/>
-      </w:pPr>
-      <w:r>
-        <w:rPr>
-          <w:rFonts w:ascii="Calibri" w:hAnsi="Calibri" w:eastAsia="微软雅黑"/>
-          <w:b/>
-          <w:i w:val="0"/>
-          <w:color w:val="1B4F9C"/>
-          <w:sz w:val="26"/>
-        </w:rPr>
-        <w:t>0:40–1:30　缘起与理念（P3 缘起 → P4 理念 → P5 入厅）</w:t>
-      </w:r>
-    </w:p>
-    <w:p>
-      <w:pPr>
-        <w:spacing w:after="140" w:before="0"/>
-      </w:pPr>
-      <w:r>
-        <w:rPr>
-          <w:rFonts w:ascii="Calibri" w:hAnsi="Calibri" w:eastAsia="微软雅黑"/>
-          <w:b w:val="0"/>
-          <w:i w:val="0"/>
-          <w:sz w:val="22"/>
-        </w:rPr>
-        <w:t>出发之前，先说说这个方案从哪里来。</w:t>
-      </w:r>
-    </w:p>
-    <w:p>
-      <w:pPr>
-        <w:spacing w:after="140" w:before="0"/>
-      </w:pPr>
-      <w:r>
-        <w:rPr>
-          <w:rFonts w:ascii="Calibri" w:hAnsi="Calibri" w:eastAsia="微软雅黑"/>
-          <w:b w:val="0"/>
-          <w:i w:val="0"/>
-          <w:sz w:val="22"/>
-        </w:rPr>
-        <w:t>（P3，时空照片流浮现）博彦科技三十年，一步一步走来——从 1995 年创立，到今天服务全球客户。这些老照片在空间里漂浮、流动，就像时间本身。我们做展厅设计的第一个念头就是：这三十年，值得被走进，而不只是被挂在墙上。</w:t>
-      </w:r>
-    </w:p>
-    <w:p>
-      <w:pPr>
-        <w:spacing w:after="140" w:before="0"/>
-      </w:pPr>
-      <w:r>
-        <w:rPr>
-          <w:rFonts w:ascii="Calibri" w:hAnsi="Calibri" w:eastAsia="微软雅黑"/>
-          <w:b w:val="0"/>
-          <w:i w:val="0"/>
-          <w:sz w:val="22"/>
-        </w:rPr>
-        <w:t>（P4）所以我们提出“三合一”的整体理念：前厅立信任之形，展厅显数智之实，空间成流动之库。一句话——整个展厅，是一条完整的信任之旅。</w:t>
-      </w:r>
-    </w:p>
-    <w:p>
-      <w:pPr>
-        <w:spacing w:after="140" w:before="0"/>
-      </w:pPr>
-      <w:r>
-        <w:rPr>
-          <w:rFonts w:ascii="Calibri" w:hAnsi="Calibri" w:eastAsia="微软雅黑"/>
-          <w:b w:val="0"/>
-          <w:i w:val="0"/>
-          <w:sz w:val="22"/>
-        </w:rPr>
-        <w:t>（P5）好，现在，请各位跟我走进来。</w:t>
-      </w:r>
-    </w:p>
-    <w:p>
-      <w:pPr>
-        <w:spacing w:after="160" w:before="280"/>
-      </w:pPr>
-      <w:r>
-        <w:rPr>
-          <w:rFonts w:ascii="Calibri" w:hAnsi="Calibri" w:eastAsia="微软雅黑"/>
-          <w:b/>
-          <w:i w:val="0"/>
-          <w:color w:val="1B4F9C"/>
-          <w:sz w:val="26"/>
-        </w:rPr>
-        <w:t>1:30–2:30　全局一览（P6 现状 → P7 总平面 → P8 动线 → P9 点位）</w:t>
-      </w:r>
-    </w:p>
-    <w:p>
-      <w:pPr>
-        <w:spacing w:after="140" w:before="0"/>
-      </w:pPr>
-      <w:r>
-        <w:rPr>
-          <w:rFonts w:ascii="Calibri" w:hAnsi="Calibri" w:eastAsia="微软雅黑"/>
-          <w:b w:val="0"/>
-          <w:i w:val="0"/>
-          <w:sz w:val="22"/>
-        </w:rPr>
-        <w:t>（P7，分区依次亮起）这是 480 平米的总平面。四个区一目了然：A 前厅接待区迎接第一印象，B 序厅树企业形象，C、D 两个展区承载企业生态和产品，中心是会议群和服务核。</w:t>
-      </w:r>
-    </w:p>
-    <w:p>
-      <w:pPr>
-        <w:spacing w:after="140" w:before="0"/>
-      </w:pPr>
-      <w:r>
-        <w:rPr>
-          <w:rFonts w:ascii="Calibri" w:hAnsi="Calibri" w:eastAsia="微软雅黑"/>
-          <w:b w:val="0"/>
-          <w:i w:val="0"/>
-          <w:sz w:val="22"/>
-        </w:rPr>
-        <w:t>（P8，蓝色动线流动）请注意这条蓝色的线——这就是我们等一下要走的路。从大门进来，环绕一圈，不走回头路，每一步都有内容。客户在这条线上，会经历了解、感受、认同三个阶段。</w:t>
-      </w:r>
-    </w:p>
-    <w:p>
-      <w:pPr>
-        <w:spacing w:after="140" w:before="0"/>
-      </w:pPr>
-      <w:r>
-        <w:rPr>
-          <w:rFonts w:ascii="Calibri" w:hAnsi="Calibri" w:eastAsia="微软雅黑"/>
-          <w:b w:val="0"/>
-          <w:i w:val="0"/>
-          <w:sz w:val="22"/>
-        </w:rPr>
-        <w:t>（P9）沿线十五个点位，每一个都编了号，等一下我挑最关键的几个，带各位细看。</w:t>
-      </w:r>
-    </w:p>
-    <w:p>
-      <w:pPr>
-        <w:spacing w:after="160" w:before="280"/>
-      </w:pPr>
-      <w:r>
-        <w:rPr>
-          <w:rFonts w:ascii="Calibri" w:hAnsi="Calibri" w:eastAsia="微软雅黑"/>
-          <w:b/>
-          <w:i w:val="0"/>
-          <w:color w:val="1B4F9C"/>
-          <w:sz w:val="26"/>
-        </w:rPr>
-        <w:t>2:30–4:00　第一章 · 入口前厅（P11–P16）</w:t>
-      </w:r>
-    </w:p>
-    <w:p>
-      <w:pPr>
-        <w:spacing w:after="140" w:before="0"/>
-      </w:pPr>
-      <w:r>
-        <w:rPr>
-          <w:rFonts w:ascii="Calibri" w:hAnsi="Calibri" w:eastAsia="微软雅黑"/>
-          <w:b w:val="0"/>
-          <w:i w:val="0"/>
-          <w:sz w:val="22"/>
-        </w:rPr>
-        <w:t>（P12）第一章，入口前厅——博彦科技的第一印象。</w:t>
-      </w:r>
-    </w:p>
-    <w:p>
-      <w:pPr>
-        <w:spacing w:after="140" w:before="0"/>
-      </w:pPr>
-      <w:r>
-        <w:rPr>
-          <w:rFonts w:ascii="Calibri" w:hAnsi="Calibri" w:eastAsia="微软雅黑"/>
-          <w:b w:val="0"/>
-          <w:i w:val="0"/>
-          <w:sz w:val="22"/>
-        </w:rPr>
-        <w:t>电梯门打开，客户看到的是什么？（P13）是一扇窗。深圳的天际线就挂在接待台后面，城市的黄昏和灯火，成了前厅的第一件展品。我们刻意把这里做得克制：蓝色品牌墙、白色接待台，把最好的画面留给城市。</w:t>
-      </w:r>
-    </w:p>
-    <w:p>
-      <w:pPr>
-        <w:spacing w:after="140" w:before="0"/>
-      </w:pPr>
-      <w:r>
-        <w:rPr>
-          <w:rFonts w:ascii="Calibri" w:hAnsi="Calibri" w:eastAsia="微软雅黑"/>
-          <w:b w:val="0"/>
-          <w:i w:val="0"/>
-          <w:sz w:val="22"/>
-        </w:rPr>
-        <w:t>（P14）换个角度看——前台、品牌形象墙、展厅入口在同一个画面里。客户在前台登记的那一分钟，蓝色的门廊就在余光里静静等他。</w:t>
-      </w:r>
-    </w:p>
-    <w:p>
-      <w:pPr>
-        <w:spacing w:after="140" w:before="0"/>
-      </w:pPr>
-      <w:r>
-        <w:rPr>
-          <w:rFonts w:ascii="Calibri" w:hAnsi="Calibri" w:eastAsia="微软雅黑"/>
-          <w:b w:val="0"/>
-          <w:i w:val="0"/>
-          <w:sz w:val="22"/>
-        </w:rPr>
-        <w:t>（P15，漫游视频播放）这是前厅的动态漫游。推开门，深圳在窗外亮起——故事从这座城市讲起。</w:t>
-      </w:r>
-    </w:p>
-    <w:p>
-      <w:pPr>
-        <w:spacing w:after="140" w:before="0"/>
-      </w:pPr>
-      <w:r>
-        <w:rPr>
-          <w:rFonts w:ascii="Calibri" w:hAnsi="Calibri" w:eastAsia="微软雅黑"/>
-          <w:b w:val="0"/>
-          <w:i w:val="0"/>
-          <w:sz w:val="22"/>
-        </w:rPr>
-        <w:t>（P16）然后，客户会穿过这扇仪式之门。以品牌菱形为门，光由暗处生长。这是进入核心叙事前的一次呼吸，也是情绪的第一次转折。</w:t>
-      </w:r>
-    </w:p>
-    <w:p>
-      <w:pPr>
-        <w:spacing w:after="160" w:before="280"/>
-      </w:pPr>
-      <w:r>
-        <w:rPr>
-          <w:rFonts w:ascii="Calibri" w:hAnsi="Calibri" w:eastAsia="微软雅黑"/>
-          <w:b/>
-          <w:i w:val="0"/>
-          <w:color w:val="1B4F9C"/>
-          <w:sz w:val="26"/>
-        </w:rPr>
-        <w:t>4:00–6:00　第二章 · 序厅与展厅（P18–P27）</w:t>
-      </w:r>
-    </w:p>
-    <w:p>
-      <w:pPr>
-        <w:spacing w:after="140" w:before="0"/>
-      </w:pPr>
-      <w:r>
-        <w:rPr>
-          <w:rFonts w:ascii="Calibri" w:hAnsi="Calibri" w:eastAsia="微软雅黑"/>
-          <w:b w:val="0"/>
-          <w:i w:val="0"/>
-          <w:sz w:val="22"/>
-        </w:rPr>
-        <w:t>（P18）门开了。第二章，关于博彦。</w:t>
-      </w:r>
-    </w:p>
-    <w:p>
-      <w:pPr>
-        <w:spacing w:after="140" w:before="0"/>
-      </w:pPr>
-      <w:r>
-        <w:rPr>
-          <w:rFonts w:ascii="Calibri" w:hAnsi="Calibri" w:eastAsia="微软雅黑"/>
-          <w:b w:val="0"/>
-          <w:i w:val="0"/>
-          <w:sz w:val="22"/>
-        </w:rPr>
-        <w:t>迎宾门电动开启，正对着的，是一块 217 寸的星图大屏。（P19，数字滚动）23 座国内城市、13 个国家、80 多个交付中心，在屏上化作星点，汇成一只“智慧之眼”；2000 多项专利软著像星轨一样流动。客户进门的第一秒，就被博彦的体量震撼到。</w:t>
-      </w:r>
-    </w:p>
-    <w:p>
-      <w:pPr>
-        <w:spacing w:after="140" w:before="0"/>
-      </w:pPr>
-      <w:r>
-        <w:rPr>
-          <w:rFonts w:ascii="Calibri" w:hAnsi="Calibri" w:eastAsia="微软雅黑"/>
-          <w:b w:val="0"/>
-          <w:i w:val="0"/>
-          <w:sz w:val="22"/>
-        </w:rPr>
-        <w:t>（P20，大屏视频亮起）而且这块屏不是摆设——它是真正的内容引擎。您现在看到的，就是它在真实空间里播放企业宣传片的样子。</w:t>
-      </w:r>
-    </w:p>
-    <w:p>
-      <w:pPr>
-        <w:spacing w:after="140" w:before="0"/>
-      </w:pPr>
-      <w:r>
-        <w:rPr>
-          <w:rFonts w:ascii="Calibri" w:hAnsi="Calibri" w:eastAsia="微软雅黑"/>
-          <w:b w:val="0"/>
-          <w:i w:val="0"/>
-          <w:sz w:val="22"/>
-        </w:rPr>
-        <w:t>（P21）大屏侧面，三十年发展时间轴落在弧形展墙上：1995 初创起步、2001 发展开拓、2006 跨越深耕、2012 上市整合、2016 转型升级、2020 变革创新——年份流动，一眼读完三十年。</w:t>
-      </w:r>
-    </w:p>
-    <w:p>
-      <w:pPr>
-        <w:spacing w:after="140" w:before="0"/>
-      </w:pPr>
-      <w:r>
-        <w:rPr>
-          <w:rFonts w:ascii="Calibri" w:hAnsi="Calibri" w:eastAsia="微软雅黑"/>
-          <w:b w:val="0"/>
-          <w:i w:val="0"/>
-          <w:sz w:val="22"/>
-        </w:rPr>
-        <w:t>（P22、P23，星空顶闪烁）请抬头。整个序厅的天花，是一片光纤星空顶。星光闪烁、流星划过，配合氛围音乐——我们希望客户在这里停留的每一秒，都值得发朋友圈。</w:t>
-      </w:r>
-    </w:p>
-    <w:p>
-      <w:pPr>
-        <w:spacing w:after="140" w:before="0"/>
-      </w:pPr>
-      <w:r>
-        <w:rPr>
-          <w:rFonts w:ascii="Calibri" w:hAnsi="Calibri" w:eastAsia="微软雅黑"/>
-          <w:b w:val="0"/>
-          <w:i w:val="0"/>
-          <w:sz w:val="22"/>
-        </w:rPr>
-        <w:t>（P24）接着沿大弧墙进入产品展示区：金融、能源、AI 三大舱段依次展开，企业生态和产品体验都在这里。（P25–27）数据像河流一样在弧墙上流动——产品不再是展板，而是可以触摸的内容。</w:t>
-      </w:r>
-    </w:p>
-    <w:p>
-      <w:pPr>
-        <w:spacing w:after="160" w:before="280"/>
-      </w:pPr>
-      <w:r>
-        <w:rPr>
-          <w:rFonts w:ascii="Calibri" w:hAnsi="Calibri" w:eastAsia="微软雅黑"/>
-          <w:b/>
-          <w:i w:val="0"/>
-          <w:color w:val="1B4F9C"/>
-          <w:sz w:val="26"/>
-        </w:rPr>
-        <w:t>6:00–7:30　第三章 · 会议区（P28–P34）</w:t>
-      </w:r>
-    </w:p>
-    <w:p>
-      <w:pPr>
-        <w:spacing w:after="140" w:before="0"/>
-      </w:pPr>
-      <w:r>
-        <w:rPr>
-          <w:rFonts w:ascii="Calibri" w:hAnsi="Calibri" w:eastAsia="微软雅黑"/>
-          <w:b w:val="0"/>
-          <w:i w:val="0"/>
-          <w:sz w:val="22"/>
-        </w:rPr>
-        <w:t>（P28）走完一圈，动线自然回到中心——第三章，多功能会议室。这里是整场参观的高潮：谈判与签约，在此发生。</w:t>
-      </w:r>
-    </w:p>
-    <w:p>
-      <w:pPr>
-        <w:spacing w:after="140" w:before="0"/>
-      </w:pPr>
-      <w:r>
-        <w:rPr>
-          <w:rFonts w:ascii="Calibri" w:hAnsi="Calibri" w:eastAsia="微软雅黑"/>
-          <w:b w:val="0"/>
-          <w:i w:val="0"/>
-          <w:sz w:val="22"/>
-        </w:rPr>
-        <w:t>（P29）我们说，参观的终点，是合作的起点。（P30，会议室大屏视频）弧形围合的洽谈区、正中的智能大屏——刚才在展厅里种下的信任，在这张桌子上收获。</w:t>
-      </w:r>
-    </w:p>
-    <w:p>
-      <w:pPr>
-        <w:spacing w:after="140" w:before="0"/>
-      </w:pPr>
-      <w:r>
-        <w:rPr>
-          <w:rFonts w:ascii="Calibri" w:hAnsi="Calibri" w:eastAsia="微软雅黑"/>
-          <w:b w:val="0"/>
-          <w:i w:val="0"/>
-          <w:sz w:val="22"/>
-        </w:rPr>
-        <w:t>（P32–34）周边配套两间 4–6 人小会议室和一间中会议室：灰色吸音毛毡墙、穿孔吸音吊顶、椭圆会议桌，玻璃隔断用渐变膜保证私密。日常洽谈、项目协作，安静体面。</w:t>
-      </w:r>
-    </w:p>
-    <w:p>
-      <w:pPr>
-        <w:spacing w:after="160" w:before="280"/>
-      </w:pPr>
-      <w:r>
-        <w:rPr>
-          <w:rFonts w:ascii="Calibri" w:hAnsi="Calibri" w:eastAsia="微软雅黑"/>
-          <w:b/>
-          <w:i w:val="0"/>
-          <w:color w:val="1B4F9C"/>
-          <w:sz w:val="26"/>
-        </w:rPr>
-        <w:t>7:30–8:20　方案二 · 另一种可能（P35–P39）</w:t>
-      </w:r>
-    </w:p>
-    <w:p>
-      <w:pPr>
-        <w:spacing w:after="140" w:before="0"/>
-      </w:pPr>
-      <w:r>
-        <w:rPr>
-          <w:rFonts w:ascii="Calibri" w:hAnsi="Calibri" w:eastAsia="微软雅黑"/>
-          <w:b w:val="0"/>
-          <w:i w:val="0"/>
-          <w:sz w:val="22"/>
-        </w:rPr>
-        <w:t>（P35）除了刚才走的这条路，我们还准备了方案二——同一个平面，另一种性格。</w:t>
-      </w:r>
-    </w:p>
-    <w:p>
-      <w:pPr>
-        <w:spacing w:after="140" w:before="0"/>
-      </w:pPr>
-      <w:r>
-        <w:rPr>
-          <w:rFonts w:ascii="Calibri" w:hAnsi="Calibri" w:eastAsia="微软雅黑"/>
-          <w:b w:val="0"/>
-          <w:i w:val="0"/>
-          <w:sz w:val="22"/>
-        </w:rPr>
-        <w:t>（P36）分区更开敞，从过廊到展厅，豁然开朗。（P37、P38）B 区企业形象用前厅茶座加品牌墙、光廊引导步入核心；（P39）C 区把企业概况、全球布局和产品体验整合成一个生态厅。</w:t>
-      </w:r>
-    </w:p>
-    <w:p>
-      <w:pPr>
-        <w:spacing w:after="140" w:before="0"/>
-      </w:pPr>
-      <w:r>
-        <w:rPr>
-          <w:rFonts w:ascii="Calibri" w:hAnsi="Calibri" w:eastAsia="微软雅黑"/>
-          <w:b w:val="0"/>
-          <w:i w:val="0"/>
-          <w:sz w:val="22"/>
-        </w:rPr>
-        <w:t>两个方案，一个重叙事沉浸，一个重开敞通透——供各位按使用习惯选择，也可以交叉组合。</w:t>
-      </w:r>
-    </w:p>
-    <w:p>
-      <w:pPr>
-        <w:spacing w:after="160" w:before="280"/>
-      </w:pPr>
-      <w:r>
-        <w:rPr>
-          <w:rFonts w:ascii="Calibri" w:hAnsi="Calibri" w:eastAsia="微软雅黑"/>
-          <w:b/>
-          <w:i w:val="0"/>
-          <w:color w:val="1B4F9C"/>
-          <w:sz w:val="26"/>
-        </w:rPr>
-        <w:t>8:20–9:20　落地保障（P40 时间计划 → P41 投资估算）</w:t>
-      </w:r>
-    </w:p>
-    <w:p>
-      <w:pPr>
-        <w:spacing w:after="140" w:before="0"/>
-      </w:pPr>
-      <w:r>
-        <w:rPr>
-          <w:rFonts w:ascii="Calibri" w:hAnsi="Calibri" w:eastAsia="微软雅黑"/>
-          <w:b w:val="0"/>
-          <w:i w:val="0"/>
-          <w:sz w:val="22"/>
-        </w:rPr>
-        <w:t>（P40）方案再好，落地才算数。实施计划分四段：设计深化、图纸定稿、进场施工、交付验收——分段推进，办公不中断。</w:t>
-      </w:r>
-    </w:p>
-    <w:p>
-      <w:pPr>
-        <w:spacing w:after="140" w:before="0"/>
-      </w:pPr>
-      <w:r>
-        <w:rPr>
-          <w:rFonts w:ascii="Calibri" w:hAnsi="Calibri" w:eastAsia="微软雅黑"/>
-          <w:b w:val="0"/>
-          <w:i w:val="0"/>
-          <w:sz w:val="22"/>
-        </w:rPr>
-        <w:t>（P41）投资方面，全套工程量清单可以逐项核对：直接费 116.12 万，设计服务费按 10% 计 11.97 万，税金 9% 计 11.53 万——装修工程合计 139.61 万元，单方造价约 2900 元。含开荒保洁与物业管理费，口径清晰，没有藏项。</w:t>
-      </w:r>
-    </w:p>
-    <w:p>
-      <w:pPr>
-        <w:spacing w:after="160" w:before="280"/>
-      </w:pPr>
-      <w:r>
-        <w:rPr>
-          <w:rFonts w:ascii="Calibri" w:hAnsi="Calibri" w:eastAsia="微软雅黑"/>
-          <w:b/>
-          <w:i w:val="0"/>
-          <w:color w:val="1B4F9C"/>
-          <w:sz w:val="26"/>
-        </w:rPr>
-        <w:t>9:20–10:00　结尾（P42）</w:t>
-      </w:r>
-    </w:p>
-    <w:p>
-      <w:pPr>
-        <w:spacing w:after="140" w:before="0"/>
-      </w:pPr>
-      <w:r>
-        <w:rPr>
-          <w:rFonts w:ascii="Calibri" w:hAnsi="Calibri" w:eastAsia="微软雅黑"/>
-          <w:b w:val="0"/>
-          <w:i w:val="0"/>
-          <w:sz w:val="22"/>
-        </w:rPr>
-        <w:t>（P42）各位，刚才我们用十分钟，替未来的客户提前走了一遍这条路：</w:t>
-      </w:r>
-    </w:p>
-    <w:p>
-      <w:pPr>
-        <w:spacing w:after="140" w:before="0"/>
-      </w:pPr>
-      <w:r>
-        <w:rPr>
-          <w:rFonts w:ascii="Calibri" w:hAnsi="Calibri" w:eastAsia="微软雅黑"/>
-          <w:b w:val="0"/>
-          <w:i w:val="0"/>
-          <w:sz w:val="22"/>
-        </w:rPr>
-        <w:t>在窗前认识深圳的博彦，在星图大屏前认识全球的博彦，在三十年时间轴前认识一路走来的博彦——最后，在会议桌前，和博彦握手。</w:t>
-      </w:r>
-    </w:p>
-    <w:p>
-      <w:pPr>
-        <w:spacing w:after="140" w:before="0"/>
-      </w:pPr>
-      <w:r>
-        <w:rPr>
-          <w:rFonts w:ascii="Calibri" w:hAnsi="Calibri" w:eastAsia="微软雅黑"/>
-          <w:b w:val="0"/>
-          <w:i w:val="0"/>
-          <w:sz w:val="22"/>
-        </w:rPr>
-        <w:t>这就是 Beyond the Hall——展厅之上，是博彦的下一个三十年。</w:t>
-      </w:r>
-    </w:p>
-    <w:p>
-      <w:pPr>
-        <w:spacing w:after="140" w:before="0"/>
-      </w:pPr>
-      <w:r>
-        <w:rPr>
-          <w:rFonts w:ascii="Calibri" w:hAnsi="Calibri" w:eastAsia="微软雅黑"/>
-          <w:b w:val="0"/>
-          <w:i w:val="0"/>
-          <w:sz w:val="22"/>
-        </w:rPr>
-        <w:t>数智共生，BeyondSoft。期待与各位，在真实的大厅里再会。谢谢！</w:t>
       </w:r>
     </w:p>
     <w:p>
@@ -676,7 +75,6 @@
         <w:rPr>
           <w:rFonts w:ascii="Calibri" w:hAnsi="Calibri" w:eastAsia="微软雅黑"/>
           <w:b/>
-          <w:i w:val="0"/>
           <w:color w:val="D8742B"/>
           <w:sz w:val="26"/>
         </w:rPr>
@@ -686,49 +84,57 @@
     <w:p>
       <w:pPr>
         <w:pStyle w:val="ListBullet"/>
+        <w:spacing w:after="60" w:before="0"/>
       </w:pPr>
       <w:r>
         <w:rPr>
           <w:rFonts w:ascii="Calibri" w:hAnsi="Calibri" w:eastAsia="微软雅黑"/>
+          <w:b w:val="0"/>
           <w:sz w:val="21"/>
         </w:rPr>
-        <w:t>全程配合自动播放模式（空格键暂停/继续），或按 → 手动控制节奏。</w:t>
+        <w:t>全程配合自动播放模式（空格键暂停/继续），或按 → 手动控制节奏</w:t>
       </w:r>
     </w:p>
     <w:p>
       <w:pPr>
         <w:pStyle w:val="ListBullet"/>
+        <w:spacing w:after="60" w:before="0"/>
       </w:pPr>
       <w:r>
         <w:rPr>
           <w:rFonts w:ascii="Calibri" w:hAnsi="Calibri" w:eastAsia="微软雅黑"/>
+          <w:b w:val="0"/>
           <w:sz w:val="21"/>
         </w:rPr>
-        <w:t>P15、P20、P27、P30 四处有视频，口播时留 5–8 秒让画面说话。</w:t>
+        <w:t>P15、P20、P27、P30 四处有视频，口播时留 5–8 秒让画面呈现</w:t>
       </w:r>
     </w:p>
     <w:p>
       <w:pPr>
         <w:pStyle w:val="ListBullet"/>
+        <w:spacing w:after="60" w:before="0"/>
       </w:pPr>
       <w:r>
         <w:rPr>
           <w:rFonts w:ascii="Calibri" w:hAnsi="Calibri" w:eastAsia="微软雅黑"/>
+          <w:b w:val="0"/>
           <w:sz w:val="21"/>
         </w:rPr>
-        <w:t>P19 数字滚动、P22/23 星空顶是情绪高点，语速放慢。</w:t>
+        <w:t>P19 数字滚动、P22/23 星空顶为视觉重点，宜放慢语速</w:t>
       </w:r>
     </w:p>
     <w:p>
       <w:pPr>
         <w:pStyle w:val="ListBullet"/>
+        <w:spacing w:after="60" w:before="0"/>
       </w:pPr>
       <w:r>
         <w:rPr>
           <w:rFonts w:ascii="Calibri" w:hAnsi="Calibri" w:eastAsia="微软雅黑"/>
+          <w:b w:val="0"/>
           <w:sz w:val="21"/>
         </w:rPr>
-        <w:t>如需压缩到 8 分钟：方案二一段（7:30–8:20）可精简为两句带过。</w:t>
+        <w:t>如需压缩至 8 分钟：方案二一节（7:30–8:20）可精简为两句概述</w:t>
       </w:r>
     </w:p>
     <w:sectPr>

</xml_diff>

<commit_message>
Fix docx generation: body paragraphs were dropped by separator split
Co-Authored-By: Claude Fable 5 <noreply@anthropic.com>
Claude-Session: https://claude.ai/code/session_01AxuY1PbheECHyFwPY2eA1Y
</commit_message>
<xml_diff>
--- a/归档包/02_展陈策划/博彦科技展厅_10分钟汇报稿_导览式.docx
+++ b/归档包/02_展陈策划/博彦科技展厅_10分钟汇报稿_导览式.docx
@@ -65,6 +65,606 @@
     <w:p>
       <w:r>
         <w:br w:type="page"/>
+      </w:r>
+    </w:p>
+    <w:p>
+      <w:pPr>
+        <w:spacing w:after="160" w:before="280"/>
+      </w:pPr>
+      <w:r>
+        <w:rPr>
+          <w:rFonts w:ascii="Calibri" w:hAnsi="Calibri" w:eastAsia="微软雅黑"/>
+          <w:b/>
+          <w:color w:val="1B4F9C"/>
+          <w:sz w:val="26"/>
+        </w:rPr>
+        <w:t>0:00–0:45 开场致意（P1 封面 → P2 目录）</w:t>
+      </w:r>
+    </w:p>
+    <w:p>
+      <w:pPr>
+        <w:spacing w:after="140" w:before="0"/>
+      </w:pPr>
+      <w:r>
+        <w:rPr>
+          <w:rFonts w:ascii="Calibri" w:hAnsi="Calibri" w:eastAsia="微软雅黑"/>
+          <w:b w:val="0"/>
+          <w:sz w:val="22"/>
+        </w:rPr>
+        <w:t>尊敬的各位领导、各位评审专家：</w:t>
+      </w:r>
+    </w:p>
+    <w:p>
+      <w:pPr>
+        <w:spacing w:after="140" w:before="0"/>
+      </w:pPr>
+      <w:r>
+        <w:rPr>
+          <w:rFonts w:ascii="Calibri" w:hAnsi="Calibri" w:eastAsia="微软雅黑"/>
+          <w:b w:val="0"/>
+          <w:sz w:val="22"/>
+        </w:rPr>
+        <w:t>大家好。感谢博彦科技给予我们汇报的机会。我们本次方案的主题是——Beyond the Hall，展厅之上。</w:t>
+      </w:r>
+    </w:p>
+    <w:p>
+      <w:pPr>
+        <w:spacing w:after="140" w:before="0"/>
+      </w:pPr>
+      <w:r>
+        <w:rPr>
+          <w:rFonts w:ascii="Calibri" w:hAnsi="Calibri" w:eastAsia="微软雅黑"/>
+          <w:b w:val="0"/>
+          <w:sz w:val="22"/>
+        </w:rPr>
+        <w:t>在接下来的十分钟里，我们不逐页宣读图纸，而是换一个视角：请各位以博彦科技一位重要客户的身份，随我从电梯厅出发，将这 480 平方米的展厅完整走一遍，在行进中检验方案的每一处设计。</w:t>
+      </w:r>
+    </w:p>
+    <w:p>
+      <w:pPr>
+        <w:spacing w:after="140" w:before="0"/>
+      </w:pPr>
+      <w:r>
+        <w:rPr>
+          <w:rFonts w:ascii="Calibri" w:hAnsi="Calibri" w:eastAsia="微软雅黑"/>
+          <w:b w:val="0"/>
+          <w:sz w:val="22"/>
+        </w:rPr>
+        <w:t>（翻至目录）参观路线概括为三步：在前厅建立第一印象，在展厅读懂企业实力，在会议室达成合作意向。这条路线，也正是我们为博彦科技每一位来访客户规划的完整接待动线。</w:t>
+      </w:r>
+    </w:p>
+    <w:p>
+      <w:pPr>
+        <w:spacing w:after="160" w:before="280"/>
+      </w:pPr>
+      <w:r>
+        <w:rPr>
+          <w:rFonts w:ascii="Calibri" w:hAnsi="Calibri" w:eastAsia="微软雅黑"/>
+          <w:b/>
+          <w:color w:val="1B4F9C"/>
+          <w:sz w:val="26"/>
+        </w:rPr>
+        <w:t>0:45–1:30 设计缘起与理念（P3 缘起 → P4 理念 → P5 入厅）</w:t>
+      </w:r>
+    </w:p>
+    <w:p>
+      <w:pPr>
+        <w:spacing w:after="140" w:before="0"/>
+      </w:pPr>
+      <w:r>
+        <w:rPr>
+          <w:rFonts w:ascii="Calibri" w:hAnsi="Calibri" w:eastAsia="微软雅黑"/>
+          <w:b w:val="0"/>
+          <w:sz w:val="22"/>
+        </w:rPr>
+        <w:t>汇报参观之前，请允许我简要说明方案的立意。</w:t>
+      </w:r>
+    </w:p>
+    <w:p>
+      <w:pPr>
+        <w:spacing w:after="140" w:before="0"/>
+      </w:pPr>
+      <w:r>
+        <w:rPr>
+          <w:rFonts w:ascii="Calibri" w:hAnsi="Calibri" w:eastAsia="微软雅黑"/>
+          <w:b w:val="0"/>
+          <w:sz w:val="22"/>
+        </w:rPr>
+        <w:t>（P3，时空照片流浮现）博彦科技三十年，自 1995 年创立至今，业务遍及全球。我们研读企业发展历程后形成的核心判断是：这三十年的积淀，应当让来访者亲身走入，而非仅仅陈列于墙面。</w:t>
+      </w:r>
+    </w:p>
+    <w:p>
+      <w:pPr>
+        <w:spacing w:after="140" w:before="0"/>
+      </w:pPr>
+      <w:r>
+        <w:rPr>
+          <w:rFonts w:ascii="Calibri" w:hAnsi="Calibri" w:eastAsia="微软雅黑"/>
+          <w:b w:val="0"/>
+          <w:sz w:val="22"/>
+        </w:rPr>
+        <w:t>（P4）由此我们提出"三合一"的整体设计理念：</w:t>
+      </w:r>
+      <w:r>
+        <w:rPr>
+          <w:rFonts w:ascii="Calibri" w:hAnsi="Calibri" w:eastAsia="微软雅黑"/>
+          <w:b/>
+          <w:sz w:val="22"/>
+        </w:rPr>
+        <w:t>前厅立信任之形，展厅显数智之实，空间成流动之库。</w:t>
+      </w:r>
+      <w:r>
+        <w:rPr>
+          <w:rFonts w:ascii="Calibri" w:hAnsi="Calibri" w:eastAsia="微软雅黑"/>
+          <w:b w:val="0"/>
+          <w:sz w:val="22"/>
+        </w:rPr>
+        <w:t>概括为一句话——整个展厅，是一条完整的信任建立之旅。</w:t>
+      </w:r>
+    </w:p>
+    <w:p>
+      <w:pPr>
+        <w:spacing w:after="140" w:before="0"/>
+      </w:pPr>
+      <w:r>
+        <w:rPr>
+          <w:rFonts w:ascii="Calibri" w:hAnsi="Calibri" w:eastAsia="微软雅黑"/>
+          <w:b w:val="0"/>
+          <w:sz w:val="22"/>
+        </w:rPr>
+        <w:t>（P5）下面，请各位随我进入方案。</w:t>
+      </w:r>
+    </w:p>
+    <w:p>
+      <w:pPr>
+        <w:spacing w:after="160" w:before="280"/>
+      </w:pPr>
+      <w:r>
+        <w:rPr>
+          <w:rFonts w:ascii="Calibri" w:hAnsi="Calibri" w:eastAsia="微软雅黑"/>
+          <w:b/>
+          <w:color w:val="1B4F9C"/>
+          <w:sz w:val="26"/>
+        </w:rPr>
+        <w:t>1:30–2:30 总体布局与参观动线（P6 现状 → P7 总平面 → P8 动线 → P9 点位）</w:t>
+      </w:r>
+    </w:p>
+    <w:p>
+      <w:pPr>
+        <w:spacing w:after="140" w:before="0"/>
+      </w:pPr>
+      <w:r>
+        <w:rPr>
+          <w:rFonts w:ascii="Calibri" w:hAnsi="Calibri" w:eastAsia="微软雅黑"/>
+          <w:b w:val="0"/>
+          <w:sz w:val="22"/>
+        </w:rPr>
+        <w:t>（P7，分区依次亮起）这是 480 平方米的功能总平面。四大分区清晰明确：A 区前厅接待，承担第一印象与来访登记；B 区序厅，树立企业形象；C、D 两区分别承载企业生态与产品展示；中部布置会议群组与服务核心。</w:t>
+      </w:r>
+    </w:p>
+    <w:p>
+      <w:pPr>
+        <w:spacing w:after="140" w:before="0"/>
+      </w:pPr>
+      <w:r>
+        <w:rPr>
+          <w:rFonts w:ascii="Calibri" w:hAnsi="Calibri" w:eastAsia="微软雅黑"/>
+          <w:b w:val="0"/>
+          <w:sz w:val="22"/>
+        </w:rPr>
+        <w:t>（P8，蓝色动线流动）请各位留意这条蓝色参观动线：自展厅大门进入，单向环绕、不走回头路，沿线内容层层递进。来访客户将依次经历"了解—感受—认同"三个阶段。</w:t>
+      </w:r>
+    </w:p>
+    <w:p>
+      <w:pPr>
+        <w:spacing w:after="140" w:before="0"/>
+      </w:pPr>
+      <w:r>
+        <w:rPr>
+          <w:rFonts w:ascii="Calibri" w:hAnsi="Calibri" w:eastAsia="微软雅黑"/>
+          <w:b w:val="0"/>
+          <w:sz w:val="22"/>
+        </w:rPr>
+        <w:t>（P9）全线共设十五个展示点位，均已编号索引。下面选取关键节点，向各位详细汇报。</w:t>
+      </w:r>
+    </w:p>
+    <w:p>
+      <w:pPr>
+        <w:spacing w:after="160" w:before="280"/>
+      </w:pPr>
+      <w:r>
+        <w:rPr>
+          <w:rFonts w:ascii="Calibri" w:hAnsi="Calibri" w:eastAsia="微软雅黑"/>
+          <w:b/>
+          <w:color w:val="1B4F9C"/>
+          <w:sz w:val="26"/>
+        </w:rPr>
+        <w:t>2:30–4:00 第一章 · 入口前厅（P11–P16）</w:t>
+      </w:r>
+    </w:p>
+    <w:p>
+      <w:pPr>
+        <w:spacing w:after="140" w:before="0"/>
+      </w:pPr>
+      <w:r>
+        <w:rPr>
+          <w:rFonts w:ascii="Calibri" w:hAnsi="Calibri" w:eastAsia="微软雅黑"/>
+          <w:b w:val="0"/>
+          <w:sz w:val="22"/>
+        </w:rPr>
+        <w:t>（P12）第一章，入口前厅——博彦科技的第一印象。</w:t>
+      </w:r>
+    </w:p>
+    <w:p>
+      <w:pPr>
+        <w:spacing w:after="140" w:before="0"/>
+      </w:pPr>
+      <w:r>
+        <w:rPr>
+          <w:rFonts w:ascii="Calibri" w:hAnsi="Calibri" w:eastAsia="微软雅黑"/>
+          <w:b w:val="0"/>
+          <w:sz w:val="22"/>
+        </w:rPr>
+        <w:t>电梯门开启，来访者首先看到的，（P13）是一面完整的景观落地窗。深圳的城市天际线成为前厅的第一件展品。此处的设计策略是克制：蓝色品牌形象墙与白色接待台构成稳定的品牌界面，将最佳视觉焦点让位于城市景观，以此传递企业的从容与自信。</w:t>
+      </w:r>
+    </w:p>
+    <w:p>
+      <w:pPr>
+        <w:spacing w:after="140" w:before="0"/>
+      </w:pPr>
+      <w:r>
+        <w:rPr>
+          <w:rFonts w:ascii="Calibri" w:hAnsi="Calibri" w:eastAsia="微软雅黑"/>
+          <w:b w:val="0"/>
+          <w:sz w:val="22"/>
+        </w:rPr>
+        <w:t>（P14）从另一视角可以看到：接待前台、品牌形象墙与展厅入口处于同一视野。客户在前台登记时，展厅的蓝色门廊已自然进入视线，形成参观的心理预备。</w:t>
+      </w:r>
+    </w:p>
+    <w:p>
+      <w:pPr>
+        <w:spacing w:after="140" w:before="0"/>
+      </w:pPr>
+      <w:r>
+        <w:rPr>
+          <w:rFonts w:ascii="Calibri" w:hAnsi="Calibri" w:eastAsia="微软雅黑"/>
+          <w:b w:val="0"/>
+          <w:sz w:val="22"/>
+        </w:rPr>
+        <w:t>（P15，漫游视频播放）这是前厅空间的动态漫游演示，请各位观看实际空间效果。</w:t>
+      </w:r>
+    </w:p>
+    <w:p>
+      <w:pPr>
+        <w:spacing w:after="140" w:before="0"/>
+      </w:pPr>
+      <w:r>
+        <w:rPr>
+          <w:rFonts w:ascii="Calibri" w:hAnsi="Calibri" w:eastAsia="微软雅黑"/>
+          <w:b w:val="0"/>
+          <w:sz w:val="22"/>
+        </w:rPr>
+        <w:t>（P16）随后，来访者将穿过这道以品牌菱形为母题的"仪式之门"。光线由暗处渐次展开——这是进入核心展区前的情绪转换节点。</w:t>
+      </w:r>
+    </w:p>
+    <w:p>
+      <w:pPr>
+        <w:spacing w:after="160" w:before="280"/>
+      </w:pPr>
+      <w:r>
+        <w:rPr>
+          <w:rFonts w:ascii="Calibri" w:hAnsi="Calibri" w:eastAsia="微软雅黑"/>
+          <w:b/>
+          <w:color w:val="1B4F9C"/>
+          <w:sz w:val="26"/>
+        </w:rPr>
+        <w:t>4:00–6:00 第二章 · 序厅与展厅（P18–P27）</w:t>
+      </w:r>
+    </w:p>
+    <w:p>
+      <w:pPr>
+        <w:spacing w:after="140" w:before="0"/>
+      </w:pPr>
+      <w:r>
+        <w:rPr>
+          <w:rFonts w:ascii="Calibri" w:hAnsi="Calibri" w:eastAsia="微软雅黑"/>
+          <w:b w:val="0"/>
+          <w:sz w:val="22"/>
+        </w:rPr>
+        <w:t>（P18）进入第二章，企业主展区。</w:t>
+      </w:r>
+    </w:p>
+    <w:p>
+      <w:pPr>
+        <w:spacing w:after="140" w:before="0"/>
+      </w:pPr>
+      <w:r>
+        <w:rPr>
+          <w:rFonts w:ascii="Calibri" w:hAnsi="Calibri" w:eastAsia="微软雅黑"/>
+          <w:b w:val="0"/>
+          <w:sz w:val="22"/>
+        </w:rPr>
+        <w:t>迎宾门电动开启，正对来访者的，是一块 217 寸星图大屏。（P19，数字滚动）23 座国内城市、13 个国家、80 余个交付中心在屏上化作星点，汇聚成"智慧之眼"；2000 余项专利软著如星轨流动。企业的全球布局与技术积淀，在入厅第一时间形成直观震撼。</w:t>
+      </w:r>
+    </w:p>
+    <w:p>
+      <w:pPr>
+        <w:spacing w:after="140" w:before="0"/>
+      </w:pPr>
+      <w:r>
+        <w:rPr>
+          <w:rFonts w:ascii="Calibri" w:hAnsi="Calibri" w:eastAsia="微软雅黑"/>
+          <w:b w:val="0"/>
+          <w:sz w:val="22"/>
+        </w:rPr>
+        <w:t>（P20，大屏视频亮起）需要说明的是，这块大屏是展厅真正的内容引擎。各位现在看到的，即是它在实际空间中播放企业宣传内容的效果。</w:t>
+      </w:r>
+    </w:p>
+    <w:p>
+      <w:pPr>
+        <w:spacing w:after="140" w:before="0"/>
+      </w:pPr>
+      <w:r>
+        <w:rPr>
+          <w:rFonts w:ascii="Calibri" w:hAnsi="Calibri" w:eastAsia="微软雅黑"/>
+          <w:b w:val="0"/>
+          <w:sz w:val="22"/>
+        </w:rPr>
+        <w:t>（P21）大屏一侧，三十年发展时间轴沿弧形展墙展开：1995 初创起步、2001 发展开拓、2006 跨越深耕、2012 上市整合、2016 转型升级、2020 变革创新——脉络清晰，一览三十年。</w:t>
+      </w:r>
+    </w:p>
+    <w:p>
+      <w:pPr>
+        <w:spacing w:after="140" w:before="0"/>
+      </w:pPr>
+      <w:r>
+        <w:rPr>
+          <w:rFonts w:ascii="Calibri" w:hAnsi="Calibri" w:eastAsia="微软雅黑"/>
+          <w:b w:val="0"/>
+          <w:sz w:val="22"/>
+        </w:rPr>
+        <w:t>（P22、P23，星空顶展示）请各位留意天花设计：序厅顶部为整片光纤星空顶，星光明灭、流星划过，配合环境音效，营造沉浸式的空间记忆点，使来访者的停留本身成为传播素材。</w:t>
+      </w:r>
+    </w:p>
+    <w:p>
+      <w:pPr>
+        <w:spacing w:after="140" w:before="0"/>
+      </w:pPr>
+      <w:r>
+        <w:rPr>
+          <w:rFonts w:ascii="Calibri" w:hAnsi="Calibri" w:eastAsia="微软雅黑"/>
+          <w:b w:val="0"/>
+          <w:sz w:val="22"/>
+        </w:rPr>
+        <w:t>（P24）沿弧形展墙进入产品展示区：金融、能源、人工智能三大板块依次展开，完整呈现企业生态与产品体系。（P25–27）数据以流动形态呈现于弧墙之上——产品展示由静态展板升级为可交互的动态内容。</w:t>
+      </w:r>
+    </w:p>
+    <w:p>
+      <w:pPr>
+        <w:spacing w:after="160" w:before="280"/>
+      </w:pPr>
+      <w:r>
+        <w:rPr>
+          <w:rFonts w:ascii="Calibri" w:hAnsi="Calibri" w:eastAsia="微软雅黑"/>
+          <w:b/>
+          <w:color w:val="1B4F9C"/>
+          <w:sz w:val="26"/>
+        </w:rPr>
+        <w:t>6:00–7:30 第三章 · 会议洽谈区（P28–P34）</w:t>
+      </w:r>
+    </w:p>
+    <w:p>
+      <w:pPr>
+        <w:spacing w:after="140" w:before="0"/>
+      </w:pPr>
+      <w:r>
+        <w:rPr>
+          <w:rFonts w:ascii="Calibri" w:hAnsi="Calibri" w:eastAsia="微软雅黑"/>
+          <w:b w:val="0"/>
+          <w:sz w:val="22"/>
+        </w:rPr>
+        <w:t>（P28）参观动线最终回归中心区域——第三章，多功能会议室。这里是整条动线的收束点：商务洽谈与合作签约的正式场所。</w:t>
+      </w:r>
+    </w:p>
+    <w:p>
+      <w:pPr>
+        <w:spacing w:after="140" w:before="0"/>
+      </w:pPr>
+      <w:r>
+        <w:rPr>
+          <w:rFonts w:ascii="Calibri" w:hAnsi="Calibri" w:eastAsia="微软雅黑"/>
+          <w:b w:val="0"/>
+          <w:sz w:val="22"/>
+        </w:rPr>
+        <w:t>（P29）我们的设计主张是：参观的终点，即合作的起点。（P30，会议室大屏视频）弧形围合的洽谈区与中央智能大屏，使前序参观建立的信任，在此转化为实质性的商务成果。</w:t>
+      </w:r>
+    </w:p>
+    <w:p>
+      <w:pPr>
+        <w:spacing w:after="140" w:before="0"/>
+      </w:pPr>
+      <w:r>
+        <w:rPr>
+          <w:rFonts w:ascii="Calibri" w:hAnsi="Calibri" w:eastAsia="微软雅黑"/>
+          <w:b w:val="0"/>
+          <w:sz w:val="22"/>
+        </w:rPr>
+        <w:t>（P32–34）周边配套两间 4–6 人小会议室及一间中会议室：灰色吸音毛毡墙面、穿孔吸音吊顶、椭圆会议桌；玻璃隔断采用渐变膜处理，兼顾采光与私密。满足日常洽谈与项目协作的多层次需求。</w:t>
+      </w:r>
+    </w:p>
+    <w:p>
+      <w:pPr>
+        <w:spacing w:after="160" w:before="280"/>
+      </w:pPr>
+      <w:r>
+        <w:rPr>
+          <w:rFonts w:ascii="Calibri" w:hAnsi="Calibri" w:eastAsia="微软雅黑"/>
+          <w:b/>
+          <w:color w:val="1B4F9C"/>
+          <w:sz w:val="26"/>
+        </w:rPr>
+        <w:t>7:30–8:20 方案二 · 备选布局（P35–P39）</w:t>
+      </w:r>
+    </w:p>
+    <w:p>
+      <w:pPr>
+        <w:spacing w:after="140" w:before="0"/>
+      </w:pPr>
+      <w:r>
+        <w:rPr>
+          <w:rFonts w:ascii="Calibri" w:hAnsi="Calibri" w:eastAsia="微软雅黑"/>
+          <w:b w:val="0"/>
+          <w:sz w:val="22"/>
+        </w:rPr>
+        <w:t>（P35）在上述主推方案之外，我们同步提交方案二，供评审比选——同一平面基础上的另一种布局逻辑。</w:t>
+      </w:r>
+    </w:p>
+    <w:p>
+      <w:pPr>
+        <w:spacing w:after="140" w:before="0"/>
+      </w:pPr>
+      <w:r>
+        <w:rPr>
+          <w:rFonts w:ascii="Calibri" w:hAnsi="Calibri" w:eastAsia="微软雅黑"/>
+          <w:b w:val="0"/>
+          <w:sz w:val="22"/>
+        </w:rPr>
+        <w:t>（P36）方案二分区更为开敞，由过廊入展厅，空间豁然开朗。（P37、P38）B 区企业形象以前厅茶座结合品牌形象墙，由光廊引导进入核心展区；（P39）C 区将企业概况、全球布局与产品体验整合为一体化生态展厅。</w:t>
+      </w:r>
+    </w:p>
+    <w:p>
+      <w:pPr>
+        <w:spacing w:after="140" w:before="0"/>
+      </w:pPr>
+      <w:r>
+        <w:rPr>
+          <w:rFonts w:ascii="Calibri" w:hAnsi="Calibri" w:eastAsia="微软雅黑"/>
+          <w:b w:val="0"/>
+          <w:sz w:val="22"/>
+        </w:rPr>
+        <w:t>两个方案各有侧重：方案一重叙事沉浸，方案二重开敞通透，亦可根据使用需求交叉组合深化。</w:t>
+      </w:r>
+    </w:p>
+    <w:p>
+      <w:pPr>
+        <w:spacing w:after="160" w:before="280"/>
+      </w:pPr>
+      <w:r>
+        <w:rPr>
+          <w:rFonts w:ascii="Calibri" w:hAnsi="Calibri" w:eastAsia="微软雅黑"/>
+          <w:b/>
+          <w:color w:val="1B4F9C"/>
+          <w:sz w:val="26"/>
+        </w:rPr>
+        <w:t>8:20–9:20 实施计划与投资估算（P40 → P41）</w:t>
+      </w:r>
+    </w:p>
+    <w:p>
+      <w:pPr>
+        <w:spacing w:after="140" w:before="0"/>
+      </w:pPr>
+      <w:r>
+        <w:rPr>
+          <w:rFonts w:ascii="Calibri" w:hAnsi="Calibri" w:eastAsia="微软雅黑"/>
+          <w:b w:val="0"/>
+          <w:sz w:val="22"/>
+        </w:rPr>
+        <w:t>（P40）在实施保障方面，本项目计划分四个阶段推进：设计深化、图纸定稿、进场施工、交付验收。采取分段施工组织，确保大厦办公秩序不受影响。</w:t>
+      </w:r>
+    </w:p>
+    <w:p>
+      <w:pPr>
+        <w:spacing w:after="140" w:before="0"/>
+      </w:pPr>
+      <w:r>
+        <w:rPr>
+          <w:rFonts w:ascii="Calibri" w:hAnsi="Calibri" w:eastAsia="微软雅黑"/>
+          <w:b w:val="0"/>
+          <w:sz w:val="22"/>
+        </w:rPr>
+        <w:t>（P41）投资估算方面，全套工程量清单可逐项核对：直接费 116.12 万元；设计服务费按 10% 计 11.97 万元；税金按 9% 计 11.53 万元；</w:t>
+      </w:r>
+      <w:r>
+        <w:rPr>
+          <w:rFonts w:ascii="Calibri" w:hAnsi="Calibri" w:eastAsia="微软雅黑"/>
+          <w:b/>
+          <w:sz w:val="22"/>
+        </w:rPr>
+        <w:t>装修工程合计 139.61 万元</w:t>
+      </w:r>
+      <w:r>
+        <w:rPr>
+          <w:rFonts w:ascii="Calibri" w:hAnsi="Calibri" w:eastAsia="微软雅黑"/>
+          <w:b w:val="0"/>
+          <w:sz w:val="22"/>
+        </w:rPr>
+        <w:t>，单方造价约 2900 元。报价包含开荒保洁与物业管理费用，计价口径透明，无隐藏项目。</w:t>
+      </w:r>
+    </w:p>
+    <w:p>
+      <w:pPr>
+        <w:spacing w:after="160" w:before="280"/>
+      </w:pPr>
+      <w:r>
+        <w:rPr>
+          <w:rFonts w:ascii="Calibri" w:hAnsi="Calibri" w:eastAsia="微软雅黑"/>
+          <w:b/>
+          <w:color w:val="1B4F9C"/>
+          <w:sz w:val="26"/>
+        </w:rPr>
+        <w:t>9:20–10:00 结语（P42）</w:t>
+      </w:r>
+    </w:p>
+    <w:p>
+      <w:pPr>
+        <w:spacing w:after="140" w:before="0"/>
+      </w:pPr>
+      <w:r>
+        <w:rPr>
+          <w:rFonts w:ascii="Calibri" w:hAnsi="Calibri" w:eastAsia="微软雅黑"/>
+          <w:b w:val="0"/>
+          <w:sz w:val="22"/>
+        </w:rPr>
+        <w:t>（P42）各位领导、各位专家，刚才的十分钟，我们代替博彦科技未来的客户，提前走完了这条参观之路：</w:t>
+      </w:r>
+    </w:p>
+    <w:p>
+      <w:pPr>
+        <w:spacing w:after="140" w:before="0"/>
+      </w:pPr>
+      <w:r>
+        <w:rPr>
+          <w:rFonts w:ascii="Calibri" w:hAnsi="Calibri" w:eastAsia="微软雅黑"/>
+          <w:b w:val="0"/>
+          <w:sz w:val="22"/>
+        </w:rPr>
+        <w:t>在景观窗前认识立足深圳的博彦，在星图大屏前认识布局全球的博彦，在三十年时间轴前认识一路走来的博彦——最终，在会议桌前，与博彦达成合作。</w:t>
+      </w:r>
+    </w:p>
+    <w:p>
+      <w:pPr>
+        <w:spacing w:after="140" w:before="0"/>
+      </w:pPr>
+      <w:r>
+        <w:rPr>
+          <w:rFonts w:ascii="Calibri" w:hAnsi="Calibri" w:eastAsia="微软雅黑"/>
+          <w:b w:val="0"/>
+          <w:sz w:val="22"/>
+        </w:rPr>
+        <w:t>这就是我们方案的全部初衷——Beyond the Hall，展厅之上，承载的是博彦科技的下一个三十年。</w:t>
+      </w:r>
+    </w:p>
+    <w:p>
+      <w:pPr>
+        <w:spacing w:after="140" w:before="0"/>
+      </w:pPr>
+      <w:r>
+        <w:rPr>
+          <w:rFonts w:ascii="Calibri" w:hAnsi="Calibri" w:eastAsia="微软雅黑"/>
+          <w:b w:val="0"/>
+          <w:sz w:val="22"/>
+        </w:rPr>
+        <w:t>如有幸中标，我们承诺以最优的设计团队与施工组织，保质保量、如期交付。数智共生，BeyondSoft。恳请各位评审支持，谢谢大家！</w:t>
       </w:r>
     </w:p>
     <w:p>

</xml_diff>